<commit_message>
Completa condiciones de prueba y declaración ética del paper
- Condiciones reales en Experimental setup: salón amplio con luz natural,
  ruido bajo con conversación lejana, usuario a ~50 cm, cámara sobre la pantalla
- Ética: consentimiento verbal de apoderados; se declara explícitamente la
  ausencia de revisión formal por comité de ética como limitación
- Sin marcadores [[COMPLETAR]] pendientes

Co-Authored-By: Claude Opus 4.8 <noreply@anthropic.com>
</commit_message>
<xml_diff>
--- a/docs/GIA-TRADUCIDO-V2-corregido.docx
+++ b/docs/GIA-TRADUCIDO-V2-corregido.docx
@@ -853,7 +853,7 @@
         <w:rPr>
           <w:lang w:val="es-PE"/>
         </w:rPr>
-        <w:t xml:space="preserve">The sessions were conducted indoors under [[COMPLETAR: artificial LED ceiling lighting / mixed natural and artificial lighting]] with a predominantly frontal and diffuse incidence, and under a [[COMPLETAR: low / moderate]] ambient noise level originating mainly from [[COMPLETAR: e.g. a fan and occasional nearby conversation]]. The user remained seated at approximately [[COMPLETAR: 45-70]] cm from the camera, which was positioned at [[COMPLETAR: eye]] level. Visual capture used the laptop's integrated HD webcam at 1280 x 720 px and audio capture used the integrated microphone at 16 kHz.</w:t>
+        <w:t xml:space="preserve">The sessions were conducted indoors, in a large room with natural daylight and without crowding, under a low ambient noise level with only occasional distant conversation. Users sat at a table facing the computer, at approximately 50 cm from the camera, which was located above the screen. Visual capture used the laptop's integrated HD webcam at 1280 x 720 px and audio capture used the integrated microphone at 16 kHz.</w:t>
       </w:r>
     </w:p>
     <w:p>
@@ -4499,7 +4499,7 @@
         <w:rPr>
           <w:lang w:val="es-PE"/>
         </w:rPr>
-        <w:t xml:space="preserve">The field session was carried out with the prior institutional authorization of the OMAPED center, the public body responsible for the care of the participants. [[COMPLETAR: Informed consent was obtained from the parents or legal guardians of all participants]], who were present throughout the session together with staff from the University of Sciences and Humanities. Participation was voluntary and could be interrupted at any time. No clinical records or personal health data were collected, and all facial processing was performed locally on the device, with no transmission of images or biometric data to external services. [[COMPLETAR o BORRAR - no inventar: The study protocol was reviewed and approved by the Ethics Committee of ______ under record No. ______.]]</w:t>
+        <w:t xml:space="preserve">The field session was carried out with the prior institutional authorization of the OMAPED center, the public body responsible for the care of the participants. Verbal informed consent was obtained from the parents or legal guardians of all participants, who were present throughout the session together with staff from the University of Sciences and Humanities. Participation was voluntary and could be interrupted at any time. No clinical records or personal health data were collected, and all facial processing was performed locally on the device, with no transmission of images or biometric data to external services. The session was conducted as an exploratory field observation under institutional authorization and guardian consent; it did not undergo formal review by an institutional ethics committee, which is planned for the subsequent controlled study.</w:t>
       </w:r>
     </w:p>
     <w:p>

</xml_diff>